<commit_message>
Align midterm notebook and report with data collection and EDA scope
</commit_message>
<xml_diff>
--- a/report/data1030_report_outlier.docx
+++ b/report/data1030_report_outlier.docx
@@ -105,7 +105,7 @@
         <w:rPr>
           <w:rStyle w:val="a1"/>
         </w:rPr>
-        <w:t>Using a state’s current and lagged unemployment rates, we predict its unemployment rate three reference months ahead. If the forecasts are sufficiently accurate, state employment agencies can plan staffing and service resources in advance. At this stage, we use ordinary least squares (OLS) regression to examine how much predictive power unemployment-rate history alone can provide.</w:t>
+        <w:t>Using a state’s current and lagged unemployment rates, we plan to predict its unemployment rate three reference months ahead. If the forecasts are sufficiently accurate, state employment agencies can plan staffing and service resources in advance. At this stage, we collect and check the data and use exploratory data analysis to examine unemployment-rate patterns.</w:t>
       </w:r>
     </w:p>
     <w:p>
@@ -235,7 +235,7 @@
         <w:rPr>
           <w:rStyle w:val="a1"/>
         </w:rPr>
-        <w:t xml:space="preserve"> We then constructed unemployment rates for the previous 1, 3, 6, and 12 months within each state after aligning observations to a complete monthly calendar and set the unemployment rate for the same state three reference months later as the target variable. The complete modeling table has 5,967 rows and 9 columns. Model inputs include 5 numerical unemployment rate features and state categories. After coding the state categories, 50 dummy variables were created, resulting in a final input matrix with 55 columns. Date and future target values are not included as predictive features.</w:t>
+        <w:t xml:space="preserve"> We aligned observations to a complete monthly calendar within each state and paired the current unemployment rate with the actual rate for the same state three reference months later. For exploratory reference months from January 2015 to September 2024, the complete paired table has 5,967 rows and 5 columns: state code, reference month, current unemployment rate, future unemployment rate, and target month. These pairs are used for EDA; no model is fitted.</w:t>
       </w:r>
     </w:p>
     <w:p>
@@ -251,21 +251,19 @@
         <w:rPr>
           <w:rStyle w:val="a1"/>
         </w:rPr>
-        <w:t xml:space="preserve"> Observations from 2014 are primarily used to provide historical lags. The last three months of 2024 lack corresponding future labels and are therefore excluded from the modeling table. The observations are not independent and identically distributed (</w:t>
+        <w:t xml:space="preserve"> Observations from 2014 are retained in the source panel. The EDA focuses on 2015–2024, and the last three months of 2024 lack corresponding future labels and are therefore excluded from the paired table. The observations are not independent and identically distributed (i.i.d.). Observations within a state may be serially correlated, and states may experience common shocks.</w:t>
       </w:r>
       <w:proofErr w:type="spellStart"/>
       <w:r>
         <w:rPr>
           <w:rStyle w:val="a1"/>
         </w:rPr>
-        <w:t>i.i.d.</w:t>
       </w:r>
       <w:proofErr w:type="spellEnd"/>
       <w:r>
         <w:rPr>
           <w:rStyle w:val="a1"/>
         </w:rPr>
-        <w:t>). Observations within a state may be serially correlated, and states may experience common shocks.</w:t>
       </w:r>
     </w:p>
     <w:p>
@@ -327,7 +325,7 @@
         </w:rPr>
         <w:drawing>
           <wp:inline distT="0" distB="0" distL="0" distR="0" wp14:anchorId="0BBD4E15" wp14:editId="78693578">
-            <wp:extent cx="4480506" cy="2287271"/>
+            <wp:extent cx="4480506" cy="1991336"/>
             <wp:effectExtent l="0" t="0" r="0" b="0"/>
             <wp:docPr id="1073741825" name="officeArt object" descr="Picture 1"/>
             <wp:cNvGraphicFramePr/>
@@ -349,7 +347,7 @@
                   <pic:spPr>
                     <a:xfrm>
                       <a:off x="0" y="0"/>
-                      <a:ext cx="4480506" cy="2287271"/>
+                      <a:ext cx="4480506" cy="1991336"/>
                     </a:xfrm>
                     <a:prstGeom prst="rect">
                       <a:avLst/>
@@ -407,7 +405,7 @@
         <w:rPr>
           <w:rStyle w:val="a1"/>
         </w:rPr>
-        <w:t xml:space="preserve"> The second figure compares the current unemployment rate with the actual rate three reference months later. Among all 5,967 complete pairs, 86.1% of observations showed a change of no more than 0.5 percentage points within three months. State-level unemployment rates typically exhibit strong short-term persistence, and the data also contain observations that lie far from the equality line. The colors identify forecast-origin periods only and do not represent causal effects of the pandemic.</w:t>
+        <w:t xml:space="preserve"> The second figure compares the current unemployment rate with the actual rate three reference months later. Among all 5,967 complete pairs, 86.0% of observations showed a change of no more than 0.5 percentage points within three months. State-level unemployment rates typically exhibit strong short-term persistence, and the data also contain observations that lie far from the equality line. The colors identify forecast-origin periods only and do not represent causal effects of the pandemic.</w:t>
       </w:r>
     </w:p>
     <w:p>
@@ -428,7 +426,7 @@
         <w:lastRenderedPageBreak/>
         <w:drawing>
           <wp:inline distT="0" distB="0" distL="0" distR="0" wp14:anchorId="7735457C" wp14:editId="51B7A0DB">
-            <wp:extent cx="4480401" cy="4135755"/>
+            <wp:extent cx="4480401" cy="4806248"/>
             <wp:effectExtent l="0" t="0" r="0" b="0"/>
             <wp:docPr id="1073741826" name="officeArt object" descr="Picture 2"/>
             <wp:cNvGraphicFramePr/>
@@ -450,7 +448,7 @@
                   <pic:spPr>
                     <a:xfrm>
                       <a:off x="0" y="0"/>
-                      <a:ext cx="4480401" cy="4135755"/>
+                      <a:ext cx="4480401" cy="4806248"/>
                     </a:xfrm>
                     <a:prstGeom prst="rect">
                       <a:avLst/>
@@ -499,7 +497,7 @@
         <w:rPr>
           <w:rStyle w:val="a1"/>
         </w:rPr>
-        <w:t xml:space="preserve"> The third figure compares the distributions of the target variable between the training and testing periods. For the training reference months from 2020 to September 2021, the target unemployment rate ranged from 2.0% to 30.5%, while the testing target range was 1.7% to 5.6%. There are notable differences in the distributions between the two periods, but the current analysis cannot yet prove that this difference is responsible for the model’s negative R².</w:t>
+        <w:t xml:space="preserve"> The third figure compares the distributions of the future unemployment rate across calendar periods. For reference months in 2020–2021, the future unemployment rate ranged from 1.9% to 30.5%, while the 2022–September 2024 group ranged from 1.7% to 5.6%. These calendar periods cover different unemployment distributions; they are descriptive groups, not training and test sets.</w:t>
       </w:r>
     </w:p>
     <w:p>
@@ -520,7 +518,7 @@
         <w:lastRenderedPageBreak/>
         <w:drawing>
           <wp:inline distT="0" distB="0" distL="0" distR="0" wp14:anchorId="0CA2C050" wp14:editId="5AB86CDE">
-            <wp:extent cx="4251770" cy="2749550"/>
+            <wp:extent cx="4251770" cy="2343495"/>
             <wp:effectExtent l="0" t="0" r="0" b="0"/>
             <wp:docPr id="1073741827" name="officeArt object" descr="Picture 3"/>
             <wp:cNvGraphicFramePr/>
@@ -542,7 +540,7 @@
                   <pic:spPr>
                     <a:xfrm>
                       <a:off x="0" y="0"/>
-                      <a:ext cx="4251770" cy="2749550"/>
+                      <a:ext cx="4251770" cy="2343495"/>
                     </a:xfrm>
                     <a:prstGeom prst="rect">
                       <a:avLst/>
@@ -591,7 +589,7 @@
         <w:rPr>
           <w:rStyle w:val="a1"/>
         </w:rPr>
-        <w:t>Figure 4 examines autocorrelation separately for all 50 states and DC using 81 training-origin months per area, January 2015–September 2021. We use the mean-centered definition underlying pandas' autocorrelation plot from Lecture 10. Short-lag autocorrelation is generally positive and declines with lag, although magnitudes differ across areas. This supports examining historical rates as predictors; it does not establish forecast accuracy or validate the selected lags.</w:t>
+        <w:t>Figure 4 examines autocorrelation separately for all 50 states and DC using 120 months per area, January 2015–December 2024. We use the mean-centered definition underlying pandas' autocorrelation plot from Lecture 10. Short-lag autocorrelation is generally positive and declines with lag, although magnitudes differ across areas. This supports examining historical rates as potential predictors; it does not establish forecast accuracy or select optimal lags.</w:t>
       </w:r>
     </w:p>
     <w:p>
@@ -609,7 +607,7 @@
         <w:lastRenderedPageBreak/>
         <w:drawing>
           <wp:inline distT="0" distB="0" distL="0" distR="0" wp14:anchorId="70355624" wp14:editId="49368695">
-            <wp:extent cx="5669280" cy="2805944"/>
+            <wp:extent cx="5669280" cy="2805943"/>
             <wp:effectExtent l="0" t="0" r="0" b="0"/>
             <wp:docPr id="1073741828" name="officeArt object" descr="Picture 4"/>
             <wp:cNvGraphicFramePr/>
@@ -631,7 +629,7 @@
                   <pic:spPr>
                     <a:xfrm>
                       <a:off x="0" y="0"/>
-                      <a:ext cx="5669280" cy="2805944"/>
+                      <a:ext cx="5669280" cy="2805943"/>
                     </a:xfrm>
                     <a:prstGeom prst="rect">
                       <a:avLst/>
@@ -664,7 +662,7 @@
           <w:b w:val="0"/>
           <w:bCs w:val="0"/>
         </w:rPr>
-        <w:t>Figure 4</w:t>
+        <w:t>Figure 4: Unemployment-rate autocorrelation across 50 states and DC, January 2015–December 2024. Gray lines show each area's autocorrelation; the blue line is the median across areas at each monthly lag. The median is not the autocorrelation of an average unemployment series. Source: our BLS API data.</w:t>
       </w:r>
       <w:r>
         <w:rPr>
@@ -672,7 +670,6 @@
           <w:b w:val="0"/>
           <w:bCs w:val="0"/>
         </w:rPr>
-        <w:t>:</w:t>
       </w:r>
       <w:r>
         <w:rPr>
@@ -680,7 +677,6 @@
           <w:b w:val="0"/>
           <w:bCs w:val="0"/>
         </w:rPr>
-        <w:t xml:space="preserve"> Training-period unemployment-rate autocorrelation across 50 states and DC. Gray lines show each area's autocorrelation; the blue line is the median across areas at each monthly lag. The median is not the autocorrelation of an average unemployment series. Source: our BLS API data.</w:t>
       </w:r>
     </w:p>
     <w:p>
@@ -696,7 +692,7 @@
         <w:rPr>
           <w:rStyle w:val="a1"/>
         </w:rPr>
-        <w:t>Figures 1–3 include the already observed test period; Figure 4 uses training origins only. Any further model selection should use time-ordered validation within the training period. The existing test period must be disclosed as already inspected.</w:t>
+        <w:t>The full 2015–2024 period has already been explored and is not an untouched test set. Any subsequent model development will need time-ordered validation and an explicit account of which periods have already been inspected.</w:t>
       </w:r>
     </w:p>
     <w:p>
@@ -731,7 +727,7 @@
         <w:rPr>
           <w:rStyle w:val="a1"/>
         </w:rPr>
-        <w:t>This project is a supervised learning regression task. The model uses regions and their historical information that have already appeared during training to predict the unemployment rate as a continuous numerical value. Month t represents the reference month to which the latest published data belongs, and the target is t plus 3 months. State-level data are generally released in the month following the reference month (BLS, 2025); therefore, “three months after the reference month” does not exactly correspond to “three months from the release date.” The current code does not reconstruct the exact historical release dates for each month.</w:t>
+        <w:t>This project is a supervised regression task using panel time-series data, with monthly observations for 50 states and the District of Columbia. We aim to forecast each state's unemployment rate three reference months ahead using its historical unemployment rates and state identity. Observations are ordered in time, and rates within each state may be serially correlated, as explored in Figure 4. Month t represents the reference month to which the latest published data belongs, and the target is t plus 3 months. State-level data are generally released in the month following the reference month (BLS, 2025); therefore, “three months after the reference month” does not exactly correspond to “three months from the release date.” The current code does not reconstruct the exact historical release dates for each month.</w:t>
       </w:r>
     </w:p>
     <w:p>
@@ -747,8 +743,7 @@
         <w:rPr>
           <w:rStyle w:val="a1"/>
         </w:rPr>
-        <w:lastRenderedPageBreak/>
-        <w:t xml:space="preserve"> The current model is an ordinary least squares regression with no tuned hyperparameters. All states share coefficients for five numerical features, while state dummy variables provide state-specific intercept adjustments. The training reference months span January 2015 through September 2021, totaling 4,131 rows. The test reference months span January 2022 through September 2024, totaling 1,683 rows. The 153 rows from the last three months of 2021 were excluded because their labels fell into 2022. All training label months precede the first test reference month, and the data was not shuffled.</w:t>
+        <w:t>This API snapshot contains revised historical data and does not represent the initially released data for each month. The BLS conducts monthly and annual revisions; annual historical smoothing may also utilize information from periods after the target month (BLS, 2018, 2025). Constructing lagged variables based on time alone does not prove that all source data were available at the time. The current work is exploratory analysis using revised historical data, and the impact of data revisions on future forecast errors has not yet been quantified.</w:t>
       </w:r>
     </w:p>
     <w:p>
@@ -758,646 +753,13 @@
         <w:ind w:firstLine="720"/>
         <w:rPr>
           <w:rStyle w:val="a1"/>
-          <w:rFonts w:hint="eastAsia"/>
-        </w:rPr>
-      </w:pPr>
-      <w:r>
-        <w:t>For comparison, the persistence benchmark sets each state’s three-month-ahead forecast equal to its unemployment rate in the forecast-origin month.</w:t>
-      </w:r>
-    </w:p>
-    <w:p>
-      <w:pPr>
-        <w:pStyle w:val="Caption"/>
-        <w:spacing w:before="0" w:after="0" w:line="480" w:lineRule="auto"/>
-        <w:rPr>
-          <w:rStyle w:val="a1"/>
-        </w:rPr>
-      </w:pPr>
-      <w:r>
-        <w:rPr>
-          <w:rStyle w:val="a1"/>
-          <w:i w:val="0"/>
-          <w:iCs w:val="0"/>
-        </w:rPr>
-        <w:t>Table 1. Test-set performance of OLS and the persistence benchmark</w:t>
-      </w:r>
-    </w:p>
-    <w:tbl>
-      <w:tblPr>
-        <w:tblW w:w="9360" w:type="dxa"/>
-        <w:tblInd w:w="108" w:type="dxa"/>
-        <w:tblBorders>
-          <w:top w:val="single" w:sz="8" w:space="0" w:color="FFFFFF"/>
-          <w:left w:val="single" w:sz="8" w:space="0" w:color="FFFFFF"/>
-          <w:bottom w:val="single" w:sz="8" w:space="0" w:color="FFFFFF"/>
-          <w:right w:val="single" w:sz="8" w:space="0" w:color="FFFFFF"/>
-          <w:insideH w:val="single" w:sz="8" w:space="0" w:color="FFFFFF"/>
-          <w:insideV w:val="single" w:sz="8" w:space="0" w:color="FFFFFF"/>
-        </w:tblBorders>
-        <w:shd w:val="clear" w:color="auto" w:fill="CED7E7"/>
-        <w:tblLayout w:type="fixed"/>
-        <w:tblLook w:val="04A0" w:firstRow="1" w:lastRow="0" w:firstColumn="1" w:lastColumn="0" w:noHBand="0" w:noVBand="1"/>
-      </w:tblPr>
-      <w:tblGrid>
-        <w:gridCol w:w="4862"/>
-        <w:gridCol w:w="2104"/>
-        <w:gridCol w:w="2394"/>
-      </w:tblGrid>
-      <w:tr>
-        <w:trPr>
-          <w:trHeight w:val="610"/>
-        </w:trPr>
-        <w:tc>
-          <w:tcPr>
-            <w:tcW w:w="4861" w:type="dxa"/>
-            <w:tcBorders>
-              <w:top w:val="single" w:sz="12" w:space="0" w:color="000000"/>
-              <w:left w:val="nil"/>
-              <w:bottom w:val="single" w:sz="4" w:space="0" w:color="000000"/>
-              <w:right w:val="nil"/>
-            </w:tcBorders>
-            <w:shd w:val="clear" w:color="auto" w:fill="FFFFFF"/>
-            <w:tcMar>
-              <w:top w:w="80" w:type="dxa"/>
-              <w:left w:w="80" w:type="dxa"/>
-              <w:bottom w:w="80" w:type="dxa"/>
-              <w:right w:w="80" w:type="dxa"/>
-            </w:tcMar>
-          </w:tcPr>
-          <w:p>
-            <w:pPr>
-              <w:pStyle w:val="a"/>
-              <w:spacing w:after="0" w:line="240" w:lineRule="auto"/>
-            </w:pPr>
-            <w:r>
-              <w:rPr>
-                <w:rStyle w:val="a1"/>
-              </w:rPr>
-              <w:t xml:space="preserve"> Metrics</w:t>
-            </w:r>
-          </w:p>
-        </w:tc>
-        <w:tc>
-          <w:tcPr>
-            <w:tcW w:w="2104" w:type="dxa"/>
-            <w:tcBorders>
-              <w:top w:val="single" w:sz="12" w:space="0" w:color="000000"/>
-              <w:left w:val="nil"/>
-              <w:bottom w:val="single" w:sz="4" w:space="0" w:color="000000"/>
-              <w:right w:val="nil"/>
-            </w:tcBorders>
-            <w:shd w:val="clear" w:color="auto" w:fill="FFFFFF"/>
-            <w:tcMar>
-              <w:top w:w="80" w:type="dxa"/>
-              <w:left w:w="80" w:type="dxa"/>
-              <w:bottom w:w="80" w:type="dxa"/>
-              <w:right w:w="80" w:type="dxa"/>
-            </w:tcMar>
-          </w:tcPr>
-          <w:p>
-            <w:pPr>
-              <w:pStyle w:val="a"/>
-              <w:spacing w:after="0" w:line="240" w:lineRule="auto"/>
-            </w:pPr>
-            <w:r>
-              <w:rPr>
-                <w:rStyle w:val="a1"/>
-              </w:rPr>
-              <w:t xml:space="preserve"> Linear Regression</w:t>
-            </w:r>
-          </w:p>
-        </w:tc>
-        <w:tc>
-          <w:tcPr>
-            <w:tcW w:w="2394" w:type="dxa"/>
-            <w:tcBorders>
-              <w:top w:val="single" w:sz="12" w:space="0" w:color="000000"/>
-              <w:left w:val="nil"/>
-              <w:bottom w:val="single" w:sz="4" w:space="0" w:color="000000"/>
-              <w:right w:val="nil"/>
-            </w:tcBorders>
-            <w:shd w:val="clear" w:color="auto" w:fill="FFFFFF"/>
-            <w:tcMar>
-              <w:top w:w="80" w:type="dxa"/>
-              <w:left w:w="80" w:type="dxa"/>
-              <w:bottom w:w="80" w:type="dxa"/>
-              <w:right w:w="80" w:type="dxa"/>
-            </w:tcMar>
-          </w:tcPr>
-          <w:p>
-            <w:pPr>
-              <w:pStyle w:val="a"/>
-              <w:spacing w:after="0" w:line="240" w:lineRule="auto"/>
-            </w:pPr>
-            <w:r>
-              <w:rPr>
-                <w:rStyle w:val="a1"/>
-              </w:rPr>
-              <w:t xml:space="preserve"> Persistence Benchmark</w:t>
-            </w:r>
-          </w:p>
-        </w:tc>
-      </w:tr>
-      <w:tr>
-        <w:trPr>
-          <w:trHeight w:val="305"/>
-        </w:trPr>
-        <w:tc>
-          <w:tcPr>
-            <w:tcW w:w="4861" w:type="dxa"/>
-            <w:tcBorders>
-              <w:top w:val="single" w:sz="4" w:space="0" w:color="000000"/>
-              <w:left w:val="nil"/>
-              <w:bottom w:val="nil"/>
-              <w:right w:val="nil"/>
-            </w:tcBorders>
-            <w:shd w:val="clear" w:color="auto" w:fill="FFFFFF"/>
-            <w:tcMar>
-              <w:top w:w="80" w:type="dxa"/>
-              <w:left w:w="80" w:type="dxa"/>
-              <w:bottom w:w="80" w:type="dxa"/>
-              <w:right w:w="80" w:type="dxa"/>
-            </w:tcMar>
-          </w:tcPr>
-          <w:p>
-            <w:pPr>
-              <w:pStyle w:val="a"/>
-              <w:spacing w:after="0" w:line="240" w:lineRule="auto"/>
-            </w:pPr>
-            <w:r>
-              <w:rPr>
-                <w:rStyle w:val="a1"/>
-              </w:rPr>
-              <w:t xml:space="preserve"> RMSE (percentage points)</w:t>
-            </w:r>
-          </w:p>
-        </w:tc>
-        <w:tc>
-          <w:tcPr>
-            <w:tcW w:w="2104" w:type="dxa"/>
-            <w:tcBorders>
-              <w:top w:val="single" w:sz="4" w:space="0" w:color="000000"/>
-              <w:left w:val="nil"/>
-              <w:bottom w:val="nil"/>
-              <w:right w:val="nil"/>
-            </w:tcBorders>
-            <w:shd w:val="clear" w:color="auto" w:fill="FFFFFF"/>
-            <w:tcMar>
-              <w:top w:w="80" w:type="dxa"/>
-              <w:left w:w="80" w:type="dxa"/>
-              <w:bottom w:w="80" w:type="dxa"/>
-              <w:right w:w="80" w:type="dxa"/>
-            </w:tcMar>
-          </w:tcPr>
-          <w:p>
-            <w:pPr>
-              <w:pStyle w:val="a"/>
-              <w:spacing w:after="0" w:line="240" w:lineRule="auto"/>
-            </w:pPr>
-            <w:r>
-              <w:rPr>
-                <w:rStyle w:val="a1"/>
-              </w:rPr>
-              <w:t xml:space="preserve"> 0.854</w:t>
-            </w:r>
-          </w:p>
-        </w:tc>
-        <w:tc>
-          <w:tcPr>
-            <w:tcW w:w="2394" w:type="dxa"/>
-            <w:tcBorders>
-              <w:top w:val="single" w:sz="4" w:space="0" w:color="000000"/>
-              <w:left w:val="nil"/>
-              <w:bottom w:val="nil"/>
-              <w:right w:val="nil"/>
-            </w:tcBorders>
-            <w:shd w:val="clear" w:color="auto" w:fill="FFFFFF"/>
-            <w:tcMar>
-              <w:top w:w="80" w:type="dxa"/>
-              <w:left w:w="80" w:type="dxa"/>
-              <w:bottom w:w="80" w:type="dxa"/>
-              <w:right w:w="80" w:type="dxa"/>
-            </w:tcMar>
-          </w:tcPr>
-          <w:p>
-            <w:pPr>
-              <w:pStyle w:val="a"/>
-              <w:spacing w:after="0" w:line="240" w:lineRule="auto"/>
-            </w:pPr>
-            <w:r>
-              <w:rPr>
-                <w:rStyle w:val="a1"/>
-              </w:rPr>
-              <w:t xml:space="preserve"> 0.198</w:t>
-            </w:r>
-          </w:p>
-        </w:tc>
-      </w:tr>
-      <w:tr>
-        <w:trPr>
-          <w:trHeight w:val="310"/>
-        </w:trPr>
-        <w:tc>
-          <w:tcPr>
-            <w:tcW w:w="4861" w:type="dxa"/>
-            <w:tcBorders>
-              <w:top w:val="nil"/>
-              <w:left w:val="nil"/>
-              <w:bottom w:val="nil"/>
-              <w:right w:val="nil"/>
-            </w:tcBorders>
-            <w:shd w:val="clear" w:color="auto" w:fill="FFFFFF"/>
-            <w:tcMar>
-              <w:top w:w="80" w:type="dxa"/>
-              <w:left w:w="80" w:type="dxa"/>
-              <w:bottom w:w="80" w:type="dxa"/>
-              <w:right w:w="80" w:type="dxa"/>
-            </w:tcMar>
-          </w:tcPr>
-          <w:p>
-            <w:pPr>
-              <w:pStyle w:val="a"/>
-              <w:spacing w:after="0" w:line="240" w:lineRule="auto"/>
-            </w:pPr>
-            <w:r>
-              <w:rPr>
-                <w:rStyle w:val="a1"/>
-              </w:rPr>
-              <w:t xml:space="preserve"> MAE (percentage points)</w:t>
-            </w:r>
-          </w:p>
-        </w:tc>
-        <w:tc>
-          <w:tcPr>
-            <w:tcW w:w="2104" w:type="dxa"/>
-            <w:tcBorders>
-              <w:top w:val="nil"/>
-              <w:left w:val="nil"/>
-              <w:bottom w:val="nil"/>
-              <w:right w:val="nil"/>
-            </w:tcBorders>
-            <w:shd w:val="clear" w:color="auto" w:fill="FFFFFF"/>
-            <w:tcMar>
-              <w:top w:w="80" w:type="dxa"/>
-              <w:left w:w="80" w:type="dxa"/>
-              <w:bottom w:w="80" w:type="dxa"/>
-              <w:right w:w="80" w:type="dxa"/>
-            </w:tcMar>
-          </w:tcPr>
-          <w:p>
-            <w:pPr>
-              <w:pStyle w:val="a"/>
-              <w:spacing w:after="0" w:line="240" w:lineRule="auto"/>
-            </w:pPr>
-            <w:r>
-              <w:rPr>
-                <w:rStyle w:val="a1"/>
-              </w:rPr>
-              <w:t xml:space="preserve"> 0.772</w:t>
-            </w:r>
-          </w:p>
-        </w:tc>
-        <w:tc>
-          <w:tcPr>
-            <w:tcW w:w="2394" w:type="dxa"/>
-            <w:tcBorders>
-              <w:top w:val="nil"/>
-              <w:left w:val="nil"/>
-              <w:bottom w:val="nil"/>
-              <w:right w:val="nil"/>
-            </w:tcBorders>
-            <w:shd w:val="clear" w:color="auto" w:fill="FFFFFF"/>
-            <w:tcMar>
-              <w:top w:w="80" w:type="dxa"/>
-              <w:left w:w="80" w:type="dxa"/>
-              <w:bottom w:w="80" w:type="dxa"/>
-              <w:right w:w="80" w:type="dxa"/>
-            </w:tcMar>
-          </w:tcPr>
-          <w:p>
-            <w:pPr>
-              <w:pStyle w:val="a"/>
-              <w:spacing w:after="0" w:line="240" w:lineRule="auto"/>
-            </w:pPr>
-            <w:r>
-              <w:rPr>
-                <w:rStyle w:val="a1"/>
-              </w:rPr>
-              <w:t xml:space="preserve"> 0.141</w:t>
-            </w:r>
-          </w:p>
-        </w:tc>
-      </w:tr>
-      <w:tr>
-        <w:trPr>
-          <w:trHeight w:val="310"/>
-        </w:trPr>
-        <w:tc>
-          <w:tcPr>
-            <w:tcW w:w="4861" w:type="dxa"/>
-            <w:tcBorders>
-              <w:top w:val="nil"/>
-              <w:left w:val="nil"/>
-              <w:bottom w:val="nil"/>
-              <w:right w:val="nil"/>
-            </w:tcBorders>
-            <w:shd w:val="clear" w:color="auto" w:fill="FFFFFF"/>
-            <w:tcMar>
-              <w:top w:w="80" w:type="dxa"/>
-              <w:left w:w="80" w:type="dxa"/>
-              <w:bottom w:w="80" w:type="dxa"/>
-              <w:right w:w="80" w:type="dxa"/>
-            </w:tcMar>
-          </w:tcPr>
-          <w:p>
-            <w:pPr>
-              <w:pStyle w:val="a"/>
-              <w:spacing w:after="0" w:line="240" w:lineRule="auto"/>
-            </w:pPr>
-            <w:r>
-              <w:rPr>
-                <w:rStyle w:val="a1"/>
-              </w:rPr>
-              <w:t xml:space="preserve"> R²</w:t>
-            </w:r>
-          </w:p>
-        </w:tc>
-        <w:tc>
-          <w:tcPr>
-            <w:tcW w:w="2104" w:type="dxa"/>
-            <w:tcBorders>
-              <w:top w:val="nil"/>
-              <w:left w:val="nil"/>
-              <w:bottom w:val="nil"/>
-              <w:right w:val="nil"/>
-            </w:tcBorders>
-            <w:shd w:val="clear" w:color="auto" w:fill="FFFFFF"/>
-            <w:tcMar>
-              <w:top w:w="80" w:type="dxa"/>
-              <w:left w:w="80" w:type="dxa"/>
-              <w:bottom w:w="80" w:type="dxa"/>
-              <w:right w:w="80" w:type="dxa"/>
-            </w:tcMar>
-          </w:tcPr>
-          <w:p>
-            <w:pPr>
-              <w:pStyle w:val="a"/>
-              <w:spacing w:after="0" w:line="240" w:lineRule="auto"/>
-            </w:pPr>
-            <w:r>
-              <w:rPr>
-                <w:rStyle w:val="a1"/>
-              </w:rPr>
-              <w:t xml:space="preserve"> −0.164</w:t>
-            </w:r>
-          </w:p>
-        </w:tc>
-        <w:tc>
-          <w:tcPr>
-            <w:tcW w:w="2394" w:type="dxa"/>
-            <w:tcBorders>
-              <w:top w:val="nil"/>
-              <w:left w:val="nil"/>
-              <w:bottom w:val="nil"/>
-              <w:right w:val="nil"/>
-            </w:tcBorders>
-            <w:shd w:val="clear" w:color="auto" w:fill="FFFFFF"/>
-            <w:tcMar>
-              <w:top w:w="80" w:type="dxa"/>
-              <w:left w:w="80" w:type="dxa"/>
-              <w:bottom w:w="80" w:type="dxa"/>
-              <w:right w:w="80" w:type="dxa"/>
-            </w:tcMar>
-          </w:tcPr>
-          <w:p>
-            <w:pPr>
-              <w:pStyle w:val="a"/>
-              <w:spacing w:after="0" w:line="240" w:lineRule="auto"/>
-            </w:pPr>
-            <w:r>
-              <w:rPr>
-                <w:rStyle w:val="a1"/>
-              </w:rPr>
-              <w:t xml:space="preserve"> 0.938</w:t>
-            </w:r>
-          </w:p>
-        </w:tc>
-      </w:tr>
-      <w:tr>
-        <w:trPr>
-          <w:trHeight w:val="615"/>
-        </w:trPr>
-        <w:tc>
-          <w:tcPr>
-            <w:tcW w:w="4861" w:type="dxa"/>
-            <w:tcBorders>
-              <w:top w:val="nil"/>
-              <w:left w:val="nil"/>
-              <w:bottom w:val="single" w:sz="12" w:space="0" w:color="000000"/>
-              <w:right w:val="nil"/>
-            </w:tcBorders>
-            <w:shd w:val="clear" w:color="auto" w:fill="FFFFFF"/>
-            <w:tcMar>
-              <w:top w:w="80" w:type="dxa"/>
-              <w:left w:w="80" w:type="dxa"/>
-              <w:bottom w:w="80" w:type="dxa"/>
-              <w:right w:w="80" w:type="dxa"/>
-            </w:tcMar>
-          </w:tcPr>
-          <w:p>
-            <w:pPr>
-              <w:pStyle w:val="a"/>
-              <w:spacing w:after="0" w:line="240" w:lineRule="auto"/>
-            </w:pPr>
-            <w:r>
-              <w:rPr>
-                <w:rStyle w:val="a1"/>
-              </w:rPr>
-              <w:t xml:space="preserve"> Average Forecast Minus Actual (percentage points)</w:t>
-            </w:r>
-          </w:p>
-        </w:tc>
-        <w:tc>
-          <w:tcPr>
-            <w:tcW w:w="2104" w:type="dxa"/>
-            <w:tcBorders>
-              <w:top w:val="nil"/>
-              <w:left w:val="nil"/>
-              <w:bottom w:val="single" w:sz="12" w:space="0" w:color="000000"/>
-              <w:right w:val="nil"/>
-            </w:tcBorders>
-            <w:shd w:val="clear" w:color="auto" w:fill="FFFFFF"/>
-            <w:tcMar>
-              <w:top w:w="80" w:type="dxa"/>
-              <w:left w:w="80" w:type="dxa"/>
-              <w:bottom w:w="80" w:type="dxa"/>
-              <w:right w:w="80" w:type="dxa"/>
-            </w:tcMar>
-          </w:tcPr>
-          <w:p>
-            <w:pPr>
-              <w:pStyle w:val="a"/>
-              <w:spacing w:after="0" w:line="240" w:lineRule="auto"/>
-            </w:pPr>
-            <w:r>
-              <w:rPr>
-                <w:rStyle w:val="a1"/>
-              </w:rPr>
-              <w:t xml:space="preserve"> +0.769</w:t>
-            </w:r>
-          </w:p>
-        </w:tc>
-        <w:tc>
-          <w:tcPr>
-            <w:tcW w:w="2394" w:type="dxa"/>
-            <w:tcBorders>
-              <w:top w:val="nil"/>
-              <w:left w:val="nil"/>
-              <w:bottom w:val="single" w:sz="12" w:space="0" w:color="000000"/>
-              <w:right w:val="nil"/>
-            </w:tcBorders>
-            <w:shd w:val="clear" w:color="auto" w:fill="FFFFFF"/>
-            <w:tcMar>
-              <w:top w:w="80" w:type="dxa"/>
-              <w:left w:w="80" w:type="dxa"/>
-              <w:bottom w:w="80" w:type="dxa"/>
-              <w:right w:w="80" w:type="dxa"/>
-            </w:tcMar>
-          </w:tcPr>
-          <w:p>
-            <w:pPr>
-              <w:pStyle w:val="a"/>
-              <w:spacing w:after="0" w:line="240" w:lineRule="auto"/>
-            </w:pPr>
-            <w:r>
-              <w:rPr>
-                <w:rStyle w:val="a1"/>
-              </w:rPr>
-              <w:t xml:space="preserve"> −0.028</w:t>
-            </w:r>
-          </w:p>
-        </w:tc>
-      </w:tr>
-    </w:tbl>
-    <w:p>
-      <w:pPr>
-        <w:pStyle w:val="a"/>
-        <w:spacing w:after="0" w:line="480" w:lineRule="auto"/>
-        <w:rPr>
-          <w:rStyle w:val="a1"/>
-          <w:rFonts w:hint="eastAsia"/>
-        </w:rPr>
-      </w:pPr>
-    </w:p>
-    <w:p>
-      <w:pPr>
-        <w:pStyle w:val="BodyText"/>
-        <w:spacing w:after="0" w:line="480" w:lineRule="auto"/>
-        <w:ind w:firstLine="720"/>
-        <w:rPr>
-          <w:rStyle w:val="a1"/>
-        </w:rPr>
-      </w:pPr>
-      <w:r>
-        <w:rPr>
-          <w:rStyle w:val="a1"/>
-        </w:rPr>
-        <w:t xml:space="preserve"> On the test set, OLS substantially underperformed the persistence benchmark and overpredicted 98.5% of observations, with a mean signed error of +0.769 percentage points. </w:t>
-      </w:r>
-    </w:p>
-    <w:p>
-      <w:pPr>
-        <w:pStyle w:val="BodyText"/>
-        <w:spacing w:after="0" w:line="480" w:lineRule="auto"/>
-        <w:ind w:firstLine="720"/>
-        <w:rPr>
-          <w:rStyle w:val="a1"/>
-        </w:rPr>
-      </w:pPr>
-      <w:r>
-        <w:rPr>
-          <w:rStyle w:val="a1"/>
-        </w:rPr>
-        <w:t xml:space="preserve"> A negative R² indicates that the squared prediction error of the model is greater than the error resulting from ex post predictions using the actual mean of the test set. The R² of a test set can be less than zero; it is not equivalent to the square of a correlation coefficient (which must be non-negative), nor is it a negative prediction accuracy rate.</w:t>
-      </w:r>
-    </w:p>
-    <w:p>
-      <w:pPr>
-        <w:pStyle w:val="BodyText"/>
-        <w:spacing w:after="0" w:line="480" w:lineRule="auto"/>
-        <w:ind w:firstLine="720"/>
-        <w:rPr>
-          <w:rStyle w:val="a1"/>
-        </w:rPr>
-      </w:pPr>
-      <w:r>
-        <w:rPr>
-          <w:rStyle w:val="a1"/>
-        </w:rPr>
-        <w:lastRenderedPageBreak/>
-        <w:t xml:space="preserve">One hypothesis is that the high-volatility training period contributed to the model’s upward bias during the </w:t>
-      </w:r>
-      <w:proofErr w:type="spellStart"/>
-      <w:r>
-        <w:rPr>
-          <w:rStyle w:val="a1"/>
-        </w:rPr>
-        <w:t>later</w:t>
-      </w:r>
-      <w:proofErr w:type="spellEnd"/>
-      <w:r>
-        <w:rPr>
-          <w:rStyle w:val="a1"/>
-        </w:rPr>
-        <w:t>, more stable test period. Other possible explanations include unstable coefficients caused by correlated lag features and differences in short-term unemployment dynamics across states. These explanations have not yet been tested.</w:t>
-      </w:r>
-    </w:p>
-    <w:p>
-      <w:pPr>
-        <w:pStyle w:val="BodyText"/>
-        <w:spacing w:after="0" w:line="480" w:lineRule="auto"/>
-        <w:ind w:firstLine="720"/>
-        <w:rPr>
-          <w:rStyle w:val="a1"/>
-        </w:rPr>
-      </w:pPr>
-      <w:r>
-        <w:rPr>
-          <w:rStyle w:val="a1"/>
-        </w:rPr>
-        <w:t xml:space="preserve"> Current performance does not support deployment. Because the evaluation weights every state-month equally, the reported scores do not represent population- or labor-force-weighted national performance.</w:t>
-      </w:r>
-    </w:p>
-    <w:p>
-      <w:pPr>
-        <w:pStyle w:val="BodyText"/>
-        <w:spacing w:after="0" w:line="480" w:lineRule="auto"/>
-        <w:ind w:firstLine="720"/>
-        <w:rPr>
-          <w:rStyle w:val="a1"/>
-        </w:rPr>
-      </w:pPr>
-      <w:r>
-        <w:rPr>
-          <w:rStyle w:val="a1"/>
-        </w:rPr>
-        <w:t>This API snapshot contains revised historical data and does not represent the initially released data for each month. The BLS conducts monthly and annual revisions; annual historical smoothing may also utilize information from periods after the target month (BLS, 2018, 2025). Constructing lagged variables based on time alone does not prove that all source data were available at the time. The current work constitutes a retrospective evaluation using revised historical data, and the impact of data revisions on forecast errors has not yet been quantified.</w:t>
-      </w:r>
-    </w:p>
-    <w:p>
-      <w:pPr>
-        <w:pStyle w:val="BodyText"/>
-        <w:spacing w:after="0" w:line="480" w:lineRule="auto"/>
-        <w:ind w:firstLine="720"/>
-        <w:rPr>
-          <w:rStyle w:val="a1"/>
-        </w:rPr>
-      </w:pPr>
-      <w:r>
-        <w:rPr>
-          <w:rStyle w:val="a1"/>
-        </w:rPr>
-        <w:t>Next, we will use time-ordered validation within the training period, model changes in unemployment rates, add recent-change, trend, rolling, and seasonal features, and compare OLS, Ridge, and nonlinear models.</w:t>
+        </w:rPr>
+      </w:pPr>
+      <w:r>
+        <w:rPr>
+          <w:rStyle w:val="a1"/>
+        </w:rPr>
+        <w:t>Next, we plan to use ordinary linear regression with lagged unemployment rates and state indicators for three-month-ahead forecasting. Validation will preserve chronological order, with earlier observations used for training and later observations for validation. No model has been trained or evaluated in this midterm notebook.</w:t>
       </w:r>
     </w:p>
     <w:p>
@@ -1694,15 +1056,9 @@
           <w:lang w:val="fr-FR"/>
         </w:rPr>
       </w:pPr>
-      <w:hyperlink r:id="rId18" w:history="1">
-        <w:r>
-          <w:rPr>
-            <w:rStyle w:val="Hyperlink2"/>
-            <w:lang w:val="fr-FR"/>
-          </w:rPr>
-          <w:t>https://github.com/spcddou/outlier-data1030-fall2026/blob/main/data/data_dictionary.md</w:t>
-        </w:r>
-      </w:hyperlink>
+      <w:r>
+        <w:t>The accompanying local data/data_dictionary.md documents the source panel and the EDA paired table.</w:t>
+      </w:r>
     </w:p>
     <w:p>
       <w:pPr>

</xml_diff>

<commit_message>
Add remaining AI interaction record links to report appendix
</commit_message>
<xml_diff>
--- a/report/data1030_report_outlier.docx
+++ b/report/data1030_report_outlier.docx
@@ -1114,6 +1114,28 @@
             <w:rStyle w:val="Hyperlink2"/>
           </w:rPr>
           <w:t>https://chatgpt.com/s/t_6ada2f46e8b08191b2131f57ea51a6a2</w:t>
+        </w:r>
+      </w:hyperlink>
+      <w:r>
+        <w:br/>
+      </w:r>
+      <w:hyperlink r:id="rId24" w:history="1">
+        <w:r>
+          <w:rPr>
+            <w:rStyle w:val="Hyperlink2"/>
+          </w:rPr>
+          <w:t>https://chatgpt.com/s/t_6adcefe420c4819194e852fc1fead05f</w:t>
+        </w:r>
+      </w:hyperlink>
+      <w:r>
+        <w:br/>
+      </w:r>
+      <w:hyperlink r:id="rId25" w:history="1">
+        <w:r>
+          <w:rPr>
+            <w:rStyle w:val="Hyperlink2"/>
+          </w:rPr>
+          <w:t>https://chatgpt.com/s/t_6adcf0658eb48191986532c03cd6966c</w:t>
         </w:r>
       </w:hyperlink>
     </w:p>

</xml_diff>